<commit_message>
Add EB testcase doc
</commit_message>
<xml_diff>
--- a/input/EB-tests.docx
+++ b/input/EB-tests.docx
@@ -28,7 +28,13 @@
     </w:p>
     <w:p>
       <w:r>
-        <w:t>1.  Navigate to https://www.tnebnet.org/awp/login?locale=ta website</w:t>
+        <w:t xml:space="preserve">1.  </w:t>
+      </w:r>
+      <w:r>
+        <w:t>Open</w:t>
+      </w:r>
+      <w:r>
+        <w:t xml:space="preserve"> https://www.tnebnet.org/awp/login?locale=ta website</w:t>
       </w:r>
     </w:p>
     <w:p>
@@ -38,7 +44,10 @@
     </w:p>
     <w:p>
       <w:r>
-        <w:t>2.  Click on e-Invoice from the tabs</w:t>
+        <w:t xml:space="preserve">2.  Click on e-Invoice </w:t>
+      </w:r>
+      <w:r>
+        <w:t>link</w:t>
       </w:r>
     </w:p>
     <w:p>

</xml_diff>

<commit_message>
Read TNEB account details from .env and skip CarInfo specs by default
The EB and TNEB test cases now name the consumer and mobile numbers as
<consumer no> and <mobile no>; the generated specs read TNEB_CONSUMER_NO and
TNEB_MOBILE_NO from .env at run time. Placeholders may contain spaces, may be
written without quotes, and work in "contains" assertions.

CarInfo specs are still generated but ignored by Playwright unless
RUN_CARINFO=1 is set.

Co-Authored-By: Claude Opus 5.5 <noreply@anthropic.com>
Claude-Session: https://claude.ai/code/session_01JbRUGT6aSs4TxFgmXfvDFn
</commit_message>
<xml_diff>
--- a/input/EB-tests.docx
+++ b/input/EB-tests.docx
@@ -60,7 +60,7 @@
         <w:t xml:space="preserve">3. Enter </w:t>
       </w:r>
       <w:r>
-        <w:t xml:space="preserve">“030460031239” in the </w:t>
+        <w:t xml:space="preserve">“&lt;consumer no&gt;” in the </w:t>
       </w:r>
       <w:r>
         <w:t xml:space="preserve">Consumer </w:t>
@@ -87,7 +87,7 @@
         <w:t xml:space="preserve">4. Enter </w:t>
       </w:r>
       <w:r>
-        <w:t xml:space="preserve">“9843081645”in the </w:t>
+        <w:t xml:space="preserve">“&lt;mobile no&gt;” in the </w:t>
       </w:r>
       <w:r>
         <w:t xml:space="preserve">Registered Mobile </w:t>

</xml_diff>